<commit_message>
PD=: pie de página con el nombre del centro y criterios de evaluación con descripción real + %
- Pie de página: el marcador tenía "{{ CENTRO }}" (mayúsculas, no coincidía
  con ninguna clave real) junto a un "IES Andalán" fijo y un comentario
  "RF PONLO BIEN…"; se sustituye por {{ centro }}, y se añade "centro" al
  contexto (faltaba del todo — el diccionario data_pd ya lo traía, pero
  _build_context nunca lo copiaba a context).
- Sección C2: los criterios de evaluación no salían porque el df_ce local
  no trae desc_ce, y el respaldo del catálogo oficial fallaba porque usa
  una numeración distinta a la local (BBDD: "CE1.1", "CE1.2"... / local:
  "CE1.a", "CE1.b"...) — el id normalizado nunca coincide aunque sean los
  mismos criterios. Cuando el recuento de CE coincide entre ambas fuentes,
  se resuelve la descripción por posición dentro del RA. De paso se añade
  el % (peso_ce, ya calculado por la app en Currículo → RA y CE) delante
  de cada criterio.
</commit_message>
<xml_diff>
--- a/backend/templates/modelo_pd_fp=.docx
+++ b/backend/templates/modelo_pd_fp=.docx
@@ -3468,7 +3468,6 @@
               <w:sz w:val="18"/>
               <w:szCs w:val="18"/>
             </w:rPr>
-            <w:t xml:space="preserve"> RF PONLO BIEN… </w:t>
           </w:r>
           <w:proofErr w:type="gramStart"/>
           <w:r>
@@ -3477,7 +3476,7 @@
               <w:szCs w:val="18"/>
               <w:highlight w:val="magenta"/>
             </w:rPr>
-            <w:t>{{ CENTRO</w:t>
+            <w:t>{{ centro }}</w:t>
           </w:r>
           <w:proofErr w:type="gramEnd"/>
           <w:r>
@@ -3486,7 +3485,6 @@
               <w:szCs w:val="18"/>
               <w:highlight w:val="magenta"/>
             </w:rPr>
-            <w:t xml:space="preserve"> }} </w:t>
           </w:r>
           <w:r>
             <w:rPr>
@@ -3494,7 +3492,6 @@
               <w:szCs w:val="18"/>
               <w:highlight w:val="magenta"/>
             </w:rPr>
-            <w:t>IES Andalán</w:t>
           </w:r>
         </w:p>
       </w:tc>

</xml_diff>

<commit_message>
fix: quita el fondo rosa/magenta y las letras rojas de la plantilla PD=
Resto de marcado editorial: alguien resaltó en magenta y coloreó en rojo
los propios tags Jinja de la plantilla (los bucles {%p for ud in list_uds
%}...{{ ud }}...{%p endfor %}, {{ texto_criterios_calificacion }} en el
cuerpo, {{ centro }} en el pie de página) mientras se editaba -- nunca se
limpió antes de dejarla en producción, así que salía así en cada
programación PD= generada. Se retiran los 11 <w:highlight val="magenta">
y 16 <w:color val="FF0000"> de word/document.xml, y los 3 <w:highlight
val="magenta"> de word/footer1.xml -- solo esos dos atributos, sin tocar
el resto del formato ni la estructura.

Verificado generando una PD= real con datos DEMO: sin "magenta" ni
"FF0000" en el documento resultante, sin tags Jinja sin renderizar.

Co-Authored-By: Claude Sonnet 5 <noreply@anthropic.com>
</commit_message>
<xml_diff>
--- a/backend/templates/modelo_pd_fp=.docx
+++ b/backend/templates/modelo_pd_fp=.docx
@@ -1675,56 +1675,40 @@
     <w:p>
       <w:pPr>
         <w:ind w:left="720"/>
-        <w:rPr>
-          <w:color w:val="FF0000"/>
-        </w:rPr>
-      </w:pPr>
-      <w:r>
-        <w:rPr>
-          <w:color w:val="FF0000"/>
-        </w:rPr>
+        <w:rPr/>
+      </w:pPr>
+      <w:r>
+        <w:rPr/>
         <w:t xml:space="preserve">{%p </w:t>
       </w:r>
       <w:proofErr w:type="spellStart"/>
       <w:r>
-        <w:rPr>
-          <w:color w:val="FF0000"/>
-        </w:rPr>
+        <w:rPr/>
         <w:t>for</w:t>
       </w:r>
       <w:proofErr w:type="spellEnd"/>
       <w:r>
-        <w:rPr>
-          <w:color w:val="FF0000"/>
-        </w:rPr>
+        <w:rPr/>
         <w:t xml:space="preserve"> </w:t>
       </w:r>
       <w:proofErr w:type="spellStart"/>
       <w:r>
-        <w:rPr>
-          <w:color w:val="FF0000"/>
-        </w:rPr>
+        <w:rPr/>
         <w:t>ud</w:t>
       </w:r>
       <w:proofErr w:type="spellEnd"/>
       <w:r>
-        <w:rPr>
-          <w:color w:val="FF0000"/>
-        </w:rPr>
+        <w:rPr/>
         <w:t xml:space="preserve"> in </w:t>
       </w:r>
       <w:proofErr w:type="spellStart"/>
       <w:r>
-        <w:rPr>
-          <w:color w:val="FF0000"/>
-        </w:rPr>
+        <w:rPr/>
         <w:t>list_uds</w:t>
       </w:r>
       <w:proofErr w:type="spellEnd"/>
       <w:r>
-        <w:rPr>
-          <w:color w:val="FF0000"/>
-        </w:rPr>
+        <w:rPr/>
         <w:t xml:space="preserve"> %}</w:t>
       </w:r>
     </w:p>
@@ -1736,58 +1720,42 @@
           <w:tab w:val="num" w:pos="1080"/>
         </w:tabs>
         <w:ind w:left="1080"/>
-        <w:rPr>
-          <w:color w:val="FF0000"/>
-        </w:rPr>
+        <w:rPr/>
       </w:pPr>
       <w:proofErr w:type="gramStart"/>
       <w:r>
-        <w:rPr>
-          <w:color w:val="FF0000"/>
-        </w:rPr>
+        <w:rPr/>
         <w:t xml:space="preserve">{{ </w:t>
       </w:r>
       <w:proofErr w:type="spellStart"/>
       <w:r>
-        <w:rPr>
-          <w:color w:val="FF0000"/>
-        </w:rPr>
+        <w:rPr/>
         <w:t>ud</w:t>
       </w:r>
       <w:proofErr w:type="spellEnd"/>
       <w:proofErr w:type="gramEnd"/>
       <w:r>
-        <w:rPr>
-          <w:color w:val="FF0000"/>
-        </w:rPr>
+        <w:rPr/>
         <w:t xml:space="preserve"> }}</w:t>
       </w:r>
     </w:p>
     <w:p>
       <w:pPr>
         <w:ind w:left="720"/>
-        <w:rPr>
-          <w:color w:val="FF0000"/>
-        </w:rPr>
-      </w:pPr>
-      <w:r>
-        <w:rPr>
-          <w:color w:val="FF0000"/>
-        </w:rPr>
+        <w:rPr/>
+      </w:pPr>
+      <w:r>
+        <w:rPr/>
         <w:t xml:space="preserve">{%p </w:t>
       </w:r>
       <w:proofErr w:type="spellStart"/>
       <w:r>
-        <w:rPr>
-          <w:color w:val="FF0000"/>
-        </w:rPr>
+        <w:rPr/>
         <w:t>endfor</w:t>
       </w:r>
       <w:proofErr w:type="spellEnd"/>
       <w:r>
-        <w:rPr>
-          <w:color w:val="FF0000"/>
-        </w:rPr>
+        <w:rPr/>
         <w:t xml:space="preserve"> %}</w:t>
       </w:r>
     </w:p>
@@ -1885,9 +1853,7 @@
         <w:jc w:val="both"/>
       </w:pPr>
       <w:r>
-        <w:rPr>
-          <w:highlight w:val="magenta"/>
-        </w:rPr>
+        <w:rPr/>
         <w:t>{%p for line in list_c2 %}</w:t>
       </w:r>
       <w:r/>
@@ -1942,9 +1908,7 @@
       <w:r/>
       <w:r/>
       <w:r>
-        <w:rPr>
-          <w:highlight w:val="magenta"/>
-        </w:rPr>
+        <w:rPr/>
       </w:r>
       <w:r/>
     </w:p>
@@ -1978,36 +1942,26 @@
           <w:numId w:val="1"/>
         </w:numPr>
         <w:jc w:val="both"/>
-        <w:rPr>
-          <w:highlight w:val="magenta"/>
-        </w:rPr>
+        <w:rPr/>
       </w:pPr>
       <w:proofErr w:type="gramStart"/>
       <w:r>
-        <w:rPr>
-          <w:highlight w:val="magenta"/>
-        </w:rPr>
+        <w:rPr/>
         <w:t xml:space="preserve">{{ </w:t>
       </w:r>
       <w:proofErr w:type="spellStart"/>
       <w:r>
-        <w:rPr>
-          <w:highlight w:val="magenta"/>
-        </w:rPr>
+        <w:rPr/>
         <w:t>texto</w:t>
       </w:r>
       <w:proofErr w:type="gramEnd"/>
       <w:r>
-        <w:rPr>
-          <w:highlight w:val="magenta"/>
-        </w:rPr>
+        <w:rPr/>
         <w:t>_criterios_calificacion</w:t>
       </w:r>
       <w:proofErr w:type="spellEnd"/>
       <w:r>
-        <w:rPr>
-          <w:highlight w:val="magenta"/>
-        </w:rPr>
+        <w:rPr/>
         <w:t xml:space="preserve"> }} </w:t>
       </w:r>
     </w:p>
@@ -2494,14 +2448,10 @@
           <w:numId w:val="4"/>
         </w:numPr>
         <w:jc w:val="both"/>
-        <w:rPr>
-          <w:highlight w:val="magenta"/>
-        </w:rPr>
-      </w:pPr>
-      <w:r>
-        <w:rPr>
-          <w:highlight w:val="magenta"/>
-        </w:rPr>
+        <w:rPr/>
+      </w:pPr>
+      <w:r>
+        <w:rPr/>
         <w:t>{%p for h in list_herramientas %}</w:t>
       </w:r>
     </w:p>
@@ -2730,14 +2680,10 @@
     <w:p>
       <w:pPr>
         <w:spacing w:before="240" w:after="240"/>
-        <w:rPr>
-          <w:highlight w:val="magenta"/>
-        </w:rPr>
-      </w:pPr>
-      <w:r>
-        <w:rPr>
-          <w:highlight w:val="magenta"/>
-        </w:rPr>
+        <w:rPr/>
+      </w:pPr>
+      <w:r>
+        <w:rPr/>
         <w:t>{%p for line in list_n %}</w:t>
       </w:r>
     </w:p>
@@ -2898,7 +2844,6 @@
             <w:rPr>
               <w:sz w:val="18"/>
               <w:szCs w:val="18"/>
-              <w:highlight w:val="magenta"/>
             </w:rPr>
             <w:t>{{ centro }}</w:t>
           </w:r>
@@ -2907,14 +2852,12 @@
             <w:rPr>
               <w:sz w:val="18"/>
               <w:szCs w:val="18"/>
-              <w:highlight w:val="magenta"/>
             </w:rPr>
           </w:r>
           <w:r>
             <w:rPr>
               <w:sz w:val="18"/>
               <w:szCs w:val="18"/>
-              <w:highlight w:val="magenta"/>
             </w:rPr>
           </w:r>
         </w:p>

</xml_diff>

<commit_message>
feat(pd=): objetivos generales por UD y competencias (art. 100.2.c del Decreto 91/2024)
Co-Authored-By: Claude Sonnet 5.5 <noreply@anthropic.com>
</commit_message>
<xml_diff>
--- a/backend/templates/modelo_pd_fp=.docx
+++ b/backend/templates/modelo_pd_fp=.docx
@@ -1645,6 +1645,33 @@
       </w:pPr>
       <w:r>
         <w:t>Esta tabla relaciona cada una de las Unidades Didácticas con cada uno de los Resultados de Aprendizaje, si bien varias Unidades didácticas pueden dar respuesta a un único resultado de aprendizaje o una Unidad didáctica da respuesta a parte de varios resultados de aprendizaje, en este caso está muy definida su relación.</w:t>
+      </w:r>
+    </w:p>
+    <w:p>
+      <w:pPr>
+        <w:spacing w:line="240" w:lineRule="auto"/>
+        <w:jc w:val="both"/>
+      </w:pPr>
+      <w:r>
+        <w:t>{%p for x in list_og_ud %}</w:t>
+      </w:r>
+    </w:p>
+    <w:p>
+      <w:pPr>
+        <w:spacing w:line="240" w:lineRule="auto"/>
+        <w:jc w:val="both"/>
+      </w:pPr>
+      <w:r>
+        <w:t>{{ x }}</w:t>
+      </w:r>
+    </w:p>
+    <w:p>
+      <w:pPr>
+        <w:spacing w:line="240" w:lineRule="auto"/>
+        <w:jc w:val="both"/>
+      </w:pPr>
+      <w:r>
+        <w:t>{%p endfor %}</w:t>
       </w:r>
     </w:p>
     <w:p>

</xml_diff>